<commit_message>
Office Export: neutral by default (Calibri, blue-gray, no label or byline), optional label, opt-in family art, Excel keeps its original look
Co-Authored-By: Claude Sonnet 5.5 <noreply@anthropic.com>
Claude-Session: https://claude.ai/code/session_01Qs56CyPwtQAdyeiDNLqDfK
</commit_message>
<xml_diff>
--- a/tools/samples/Sample-Briefing.docx
+++ b/tools/samples/Sample-Briefing.docx
@@ -2,20 +2,6 @@
 <file path=word/document.xml><?xml version="1.0" encoding="utf-8"?>
 <w:document xmlns:wpc="http://schemas.microsoft.com/office/word/2010/wordprocessingCanvas" xmlns:mo="http://schemas.microsoft.com/office/mac/office/2008/main" xmlns:mc="http://schemas.openxmlformats.org/markup-compatibility/2006" xmlns:mv="urn:schemas-microsoft-com:mac:vml" xmlns:o="urn:schemas-microsoft-com:office:office" xmlns:r="http://schemas.openxmlformats.org/officeDocument/2006/relationships" xmlns:m="http://schemas.openxmlformats.org/officeDocument/2006/math" xmlns:v="urn:schemas-microsoft-com:vml" xmlns:wp14="http://schemas.microsoft.com/office/word/2010/wordprocessingDrawing" xmlns:wp="http://schemas.openxmlformats.org/drawingml/2006/wordprocessingDrawing" xmlns:w10="urn:schemas-microsoft-com:office:word" xmlns:w="http://schemas.openxmlformats.org/wordprocessingml/2006/main" xmlns:w14="http://schemas.microsoft.com/office/word/2010/wordml" xmlns:wpg="http://schemas.microsoft.com/office/word/2010/wordprocessingGroup" xmlns:wpi="http://schemas.microsoft.com/office/word/2010/wordprocessingInk" xmlns:wne="http://schemas.microsoft.com/office/word/2006/wordml" xmlns:wps="http://schemas.microsoft.com/office/word/2010/wordprocessingShape" mc:Ignorable="w14 wp14">
   <w:body>
-    <w:p>
-      <w:pPr>
-        <w:spacing w:after="120"/>
-      </w:pPr>
-      <w:r>
-        <w:rPr>
-          <w:b/>
-          <w:color w:val="D52B1E"/>
-          <w:sz w:val="18"/>
-          <w:spacing w:val="50"/>
-        </w:rPr>
-        <w:t>BUZATU · MILLER FAMILY</w:t>
-      </w:r>
-    </w:p>
     <w:p>
       <w:pPr>
         <w:pStyle w:val="Title"/>
@@ -36,15 +22,15 @@
       <w:pPr>
         <w:spacing w:after="280"/>
         <w:pBdr>
-          <w:bottom w:val="single" w:sz="18" w:space="8" w:color="2A6A98"/>
+          <w:bottom w:val="single" w:sz="12" w:space="8" w:color="3E5C76"/>
         </w:pBdr>
       </w:pPr>
       <w:r>
         <w:rPr>
           <w:color w:val="6B7785"/>
-          <w:sz w:val="19"/>
+          <w:sz w:val="8"/>
         </w:rPr>
-        <w:t>Prepared by Anne-Marie · 21 October 2026</w:t>
+        <w:t xml:space="preserve"> </w:t>
       </w:r>
     </w:p>
     <w:p>
@@ -99,7 +85,7 @@
       <w:hyperlink r:id="rId12">
         <w:r>
           <w:rPr>
-            <w:color w:val="2A6A98"/>
+            <w:color w:val="3E5C76"/>
             <w:u w:val="single"/>
           </w:rPr>
           <w:t xml:space="preserve">link</w:t>
@@ -148,10 +134,10 @@
         <w:tc>
           <w:tcPr>
             <w:tcW w:type="dxa" w:w="9298"/>
-            <w:shd w:val="clear" w:color="auto" w:fill="EAF1F7"/>
+            <w:shd w:val="clear" w:color="auto" w:fill="EDF1F5"/>
             <w:tcBorders>
               <w:top w:val="nil"/>
-              <w:left w:val="single" w:sz="36" w:color="2A6A98"/>
+              <w:left w:val="single" w:sz="36" w:color="3E5C76"/>
               <w:bottom w:val="nil"/>
               <w:right w:val="nil"/>
             </w:tcBorders>
@@ -202,11 +188,11 @@
         <w:tblLayout w:type="fixed"/>
         <w:tblLook w:firstColumn="1" w:firstRow="1" w:lastColumn="0" w:lastRow="0" w:noHBand="0" w:noVBand="1" w:val="04A0"/>
         <w:tblBorders>
-          <w:top w:val="single" w:sz="4" w:color="C9D6E2"/>
-          <w:left w:val="nil"/>
-          <w:bottom w:val="single" w:sz="4" w:color="C9D6E2"/>
-          <w:right w:val="nil"/>
-          <w:insideH w:val="single" w:sz="4" w:color="C9D6E2"/>
+          <w:top w:val="single" w:sz="4" w:color="CBD3DC"/>
+          <w:left w:val="nil"/>
+          <w:bottom w:val="single" w:sz="4" w:color="CBD3DC"/>
+          <w:right w:val="nil"/>
+          <w:insideH w:val="single" w:sz="4" w:color="CBD3DC"/>
           <w:insideV w:val="nil"/>
         </w:tblBorders>
         <w:tblCellMar>
@@ -230,7 +216,7 @@
         <w:tc>
           <w:tcPr>
             <w:tcW w:type="dxa" w:w="1415"/>
-            <w:shd w:val="clear" w:color="auto" w:fill="2A6A98"/>
+            <w:shd w:val="clear" w:color="auto" w:fill="3E5C76"/>
           </w:tcPr>
           <w:p>
             <w:pPr>
@@ -249,7 +235,7 @@
         <w:tc>
           <w:tcPr>
             <w:tcW w:type="dxa" w:w="2830"/>
-            <w:shd w:val="clear" w:color="auto" w:fill="2A6A98"/>
+            <w:shd w:val="clear" w:color="auto" w:fill="3E5C76"/>
           </w:tcPr>
           <w:p>
             <w:pPr>
@@ -268,7 +254,7 @@
         <w:tc>
           <w:tcPr>
             <w:tcW w:type="dxa" w:w="2426"/>
-            <w:shd w:val="clear" w:color="auto" w:fill="2A6A98"/>
+            <w:shd w:val="clear" w:color="auto" w:fill="3E5C76"/>
           </w:tcPr>
           <w:p>
             <w:pPr>
@@ -288,7 +274,7 @@
         <w:tc>
           <w:tcPr>
             <w:tcW w:type="dxa" w:w="2628"/>
-            <w:shd w:val="clear" w:color="auto" w:fill="2A6A98"/>
+            <w:shd w:val="clear" w:color="auto" w:fill="3E5C76"/>
           </w:tcPr>
           <w:p>
             <w:pPr>
@@ -384,7 +370,7 @@
         <w:tc>
           <w:tcPr>
             <w:tcW w:type="dxa" w:w="1415"/>
-            <w:shd w:val="clear" w:color="auto" w:fill="F4F8FB"/>
+            <w:shd w:val="clear" w:color="auto" w:fill="F5F7FA"/>
           </w:tcPr>
           <w:p>
             <w:pPr>
@@ -401,7 +387,7 @@
         <w:tc>
           <w:tcPr>
             <w:tcW w:type="dxa" w:w="2830"/>
-            <w:shd w:val="clear" w:color="auto" w:fill="F4F8FB"/>
+            <w:shd w:val="clear" w:color="auto" w:fill="F5F7FA"/>
           </w:tcPr>
           <w:p>
             <w:pPr>
@@ -418,7 +404,7 @@
         <w:tc>
           <w:tcPr>
             <w:tcW w:type="dxa" w:w="2426"/>
-            <w:shd w:val="clear" w:color="auto" w:fill="F4F8FB"/>
+            <w:shd w:val="clear" w:color="auto" w:fill="F5F7FA"/>
           </w:tcPr>
           <w:p>
             <w:pPr>
@@ -436,7 +422,7 @@
         <w:tc>
           <w:tcPr>
             <w:tcW w:type="dxa" w:w="2628"/>
-            <w:shd w:val="clear" w:color="auto" w:fill="F4F8FB"/>
+            <w:shd w:val="clear" w:color="auto" w:fill="F5F7FA"/>
           </w:tcPr>
           <w:p>
             <w:pPr>
@@ -530,7 +516,7 @@
         <w:tc>
           <w:tcPr>
             <w:tcW w:type="dxa" w:w="1415"/>
-            <w:shd w:val="clear" w:color="auto" w:fill="F4F8FB"/>
+            <w:shd w:val="clear" w:color="auto" w:fill="F5F7FA"/>
           </w:tcPr>
           <w:p>
             <w:pPr>
@@ -548,7 +534,7 @@
         <w:tc>
           <w:tcPr>
             <w:tcW w:type="dxa" w:w="2830"/>
-            <w:shd w:val="clear" w:color="auto" w:fill="F4F8FB"/>
+            <w:shd w:val="clear" w:color="auto" w:fill="F5F7FA"/>
           </w:tcPr>
           <w:p>
             <w:pPr>
@@ -559,7 +545,7 @@
         <w:tc>
           <w:tcPr>
             <w:tcW w:type="dxa" w:w="2426"/>
-            <w:shd w:val="clear" w:color="auto" w:fill="F4F8FB"/>
+            <w:shd w:val="clear" w:color="auto" w:fill="F5F7FA"/>
           </w:tcPr>
           <w:p>
             <w:pPr>
@@ -577,7 +563,7 @@
         <w:tc>
           <w:tcPr>
             <w:tcW w:type="dxa" w:w="2628"/>
-            <w:shd w:val="clear" w:color="auto" w:fill="F4F8FB"/>
+            <w:shd w:val="clear" w:color="auto" w:fill="F5F7FA"/>
           </w:tcPr>
           <w:p>
             <w:pPr>
@@ -617,7 +603,7 @@
       <w:r>
         <w:rPr>
           <w:b/>
-          <w:color w:val="2A6A98"/>
+          <w:color w:val="3E5C76"/>
         </w:rPr>
         <w:t>1.</w:t>
         <w:tab/>
@@ -637,7 +623,7 @@
       <w:r>
         <w:rPr>
           <w:b/>
-          <w:color w:val="2A6A98"/>
+          <w:color w:val="3E5C76"/>
         </w:rPr>
         <w:t>2.</w:t>
         <w:tab/>
@@ -657,7 +643,7 @@
       <w:r>
         <w:rPr>
           <w:b/>
-          <w:color w:val="2A6A98"/>
+          <w:color w:val="3E5C76"/>
         </w:rPr>
         <w:t>3.</w:t>
         <w:tab/>
@@ -725,7 +711,7 @@
       <w:pPr>
         <w:spacing w:after="120"/>
         <w:pBdr>
-          <w:bottom w:val="single" w:sz="6" w:space="1" w:color="C9D6E2"/>
+          <w:bottom w:val="single" w:sz="6" w:space="1" w:color="CBD3DC"/>
         </w:pBdr>
       </w:pPr>
     </w:p>
@@ -744,7 +730,7 @@
       <w:hyperlink r:id="rId13">
         <w:r>
           <w:rPr>
-            <w:color w:val="2A6A98"/>
+            <w:color w:val="3E5C76"/>
             <w:u w:val="single"/>
           </w:rPr>
           <w:t xml:space="preserve">Federal Chancellery</w:t>
@@ -819,7 +805,7 @@
         <w:tab w:pos="9360" w:val="clear"/>
       </w:tabs>
       <w:pBdr>
-        <w:top w:val="single" w:sz="4" w:space="6" w:color="C9D6E2"/>
+        <w:top w:val="single" w:sz="4" w:space="6" w:color="CBD3DC"/>
       </w:pBdr>
     </w:pPr>
     <w:r>
@@ -827,7 +813,6 @@
         <w:color w:val="6B7785"/>
         <w:sz w:val="17"/>
       </w:rPr>
-      <w:t>Buzatu · Miller family</w:t>
     </w:r>
     <w:r>
       <w:rPr>
@@ -931,7 +916,7 @@
         <w:tab w:pos="9360" w:val="clear"/>
       </w:tabs>
       <w:pBdr>
-        <w:top w:val="single" w:sz="4" w:space="6" w:color="C9D6E2"/>
+        <w:top w:val="single" w:sz="4" w:space="6" w:color="CBD3DC"/>
       </w:pBdr>
     </w:pPr>
     <w:r>
@@ -939,7 +924,6 @@
         <w:color w:val="6B7785"/>
         <w:sz w:val="17"/>
       </w:rPr>
-      <w:t>Buzatu · Miller family</w:t>
     </w:r>
     <w:r>
       <w:rPr>
@@ -1479,11 +1463,11 @@
       <w:outlineLvl w:val="0"/>
     </w:pPr>
     <w:rPr>
-      <w:rFonts w:ascii="Georgia" w:hAnsi="Georgia" w:eastAsia="Georgia" w:cs="Georgia"/>
-      <w:b/>
+      <w:rFonts w:ascii="Calibri Light" w:hAnsi="Calibri Light" w:eastAsia="Calibri Light" w:cs="Calibri Light"/>
+      <w:b w:val="0"/>
       <w:bCs/>
       <w:i w:val="0"/>
-      <w:color w:val="2A6A98"/>
+      <w:color w:val="3E5C76"/>
       <w:sz w:val="40"/>
       <w:szCs w:val="28"/>
     </w:rPr>
@@ -1504,12 +1488,12 @@
       <w:outlineLvl w:val="1"/>
     </w:pPr>
     <w:rPr>
-      <w:rFonts w:ascii="Georgia" w:hAnsi="Georgia" w:eastAsia="Georgia" w:cs="Georgia"/>
-      <w:b/>
+      <w:rFonts w:ascii="Calibri Light" w:hAnsi="Calibri Light" w:eastAsia="Calibri Light" w:cs="Calibri Light"/>
+      <w:b w:val="0"/>
       <w:bCs/>
       <w:i w:val="0"/>
-      <w:color w:val="2A6A98"/>
-      <w:sz w:val="30"/>
+      <w:color w:val="3E5C76"/>
+      <w:sz w:val="31"/>
       <w:szCs w:val="26"/>
     </w:rPr>
   </w:style>
@@ -1533,7 +1517,7 @@
       <w:b/>
       <w:bCs/>
       <w:i w:val="0"/>
-      <w:color w:val="1F2A37"/>
+      <w:color w:val="30465A"/>
       <w:sz w:val="25"/>
     </w:rPr>
   </w:style>
@@ -1769,9 +1753,9 @@
       <w:contextualSpacing/>
     </w:pPr>
     <w:rPr>
-      <w:rFonts w:ascii="Georgia" w:hAnsi="Georgia" w:eastAsia="Georgia" w:cs="Georgia"/>
-      <w:b/>
-      <w:color w:val="1F2A37"/>
+      <w:rFonts w:ascii="Calibri Light" w:hAnsi="Calibri Light" w:eastAsia="Calibri Light" w:cs="Calibri Light"/>
+      <w:b w:val="0"/>
+      <w:color w:val="2B3E50"/>
       <w:spacing w:val="5"/>
       <w:kern w:val="28"/>
       <w:sz w:val="56"/>

</xml_diff>